<commit_message>
Bổ sung giá liên quan và ước lượng giá cho các thiết bị chưa có giá; thêm phương án cắt giảm
- Đông khô: dùng giá Eyela FDU-2110 (cùng thông số chính FDL-2000); tủ đông: giá tủ -30 °C theo phương án nâng cấp
- 12 hạng mục ước lượng theo mặt bằng giá thị trường VN, ghi khoảng giá và căn cứ
- Tổng 28 hạng mục khoảng 24,8 tỷ; sheet Phương án cắt giảm khoảng 14,45 tỷ
- Sửa nhận xét Corrtest CS310X Option C (đúng là 8 kênh, 1 EIS) trong báo cáo và bản đánh dấu

Co-Authored-By: Claude Opus 5.5 <noreply@anthropic.com>
Claude-Session: https://claude.ai/code/session_01JLkhnZKuapW5Zj7yjV8vMu
</commit_message>
<xml_diff>
--- a/Du an PTN cao hoc Hoa hoc/Bao cao ra soat de cuong du an PTN cao hoc Hoa hoc.docx
+++ b/Du an PTN cao hoc Hoa hoc/Bao cao ra soat de cuong du an PTN cao hoc Hoa hoc.docx
@@ -512,7 +512,7 @@
           <w:b w:val="0"/>
           <w:i w:val="0"/>
         </w:rPr>
-        <w:t>Dự thảo chưa có đơn giá. Theo mặt bằng giá tham khảo thông thường trên thị trường Việt Nam cho các cấu hình tương tự, nhóm hạng mục giá trị cao gồm TGA-FTIR, hệ đo độ hòa tan 8 vị trí kèm lấy mẫu tự động và UV-Vis, Zetasizer Pro, GC-2030, AAS, máy PL, 02 UV-Vis và 02 máy đông khô có thể đã chiếm phần lớn hoặc vượt 15 tỷ đồng. Ước lượng thô của người rà soát cho toàn bộ 29 hạng mục nằm trong khoảng 18–22 tỷ đồng. Con số này chỉ dùng để cảnh báo; cần lấy tối thiểu 3 báo giá cho các hạng mục trên 1 tỷ đồng trước khi chốt danh mục, và sắp xếp thứ tự ưu tiên để cắt giảm nếu vượt.</w:t>
+        <w:t>Dự thảo chưa có đơn giá. Bảng giá tạm lập kèm báo cáo này (tệp "Doi sanh gia thiet bi (Net-zero, G9, 4 Thuoc).xlsx") dùng đơn giá của các danh mục G9 và 4_Thuốc năm 2025 cho 16 hạng mục, và ước lượng theo mặt bằng giá thị trường cho 12 hạng mục còn lại. Tổng 28 hạng mục (sau khi bỏ hệ máy tính) khoảng 24,8 tỷ đồng, vượt khoảng 9,8 tỷ đồng; riêng phần ước lượng khoảng 14,9 tỷ đồng nên sai số còn lớn. Các hạng mục lớn nhất là máy đo kích thước hạt và thế zeta (khoảng 4,4 tỷ), TGA-FTIR (khoảng 3,2 tỷ), hệ đo độ hòa tan (khoảng 3,0 tỷ), GC (khoảng 2,2 tỷ) và 02 máy đông khô (khoảng 1,8 tỷ). Sheet "Phương án cắt giảm" trong tệp này đưa ra một phương án tham khảo khoảng 14,45 tỷ đồng. Cần lấy tối thiểu 3 báo giá cho các hạng mục trên 1 tỷ đồng trước khi chốt danh mục.</w:t>
       </w:r>
     </w:p>
     <w:p>
@@ -2173,7 +2173,7 @@
               <w:rPr>
                 <w:sz w:val="22"/>
               </w:rPr>
-              <w:t>Tên "Bộ điều chỉnh điện áp đa kênh" là cách dịch không chuẩn; thuật ngữ đúng là "máy đo điện hóa đa kênh (potentiostat/galvanostat)". Lỗi chính tả "Dãi" (phải là "Dải"). Cần đối chiếu mã model với catalogue vì ký hiệu có thể thuộc dòng đơn kênh. Chỉ 1/8 kênh có EIS.</w:t>
+              <w:t>Tên "Bộ điều chỉnh điện áp đa kênh" là cách dịch không chuẩn; thuật ngữ đúng là "máy đo điện hóa đa kênh (potentiostat/galvanostat)". Lỗi chính tả "Dãi" (phải là "Dải"). Mã CS310X (Option C) đúng là cấu hình 8 kênh, 1 kênh EIS theo catalogue của hãng. Chỉ 1/8 kênh có EIS.</w:t>
             </w:r>
           </w:p>
         </w:tc>
@@ -2187,7 +2187,7 @@
               <w:rPr>
                 <w:sz w:val="22"/>
               </w:rPr>
-              <w:t>Sửa tên và chính tả; xác nhận model; nêu số kênh cần EIS theo nhu cầu nghiên cứu.</w:t>
+              <w:t>Sửa tên và chính tả; nêu số kênh cần EIS theo nhu cầu nghiên cứu (hãng có Option D: 8 kênh, 8 EIS).</w:t>
             </w:r>
           </w:p>
         </w:tc>

</xml_diff>